<commit_message>
Update group member IDs in README and add demo video and GitHub link in Report
</commit_message>
<xml_diff>
--- a/Report.docx
+++ b/Report.docx
@@ -2727,21 +2727,6 @@
     </w:p>
     <w:p>
       <w:pPr>
-        <w:ind w:left="360"/>
-      </w:pPr>
-      <w:r>
-        <w:t>Output Image:</w:t>
-      </w:r>
-    </w:p>
-    <w:p>
-      <w:pPr>
-        <w:ind w:left="360"/>
-      </w:pPr>
-      <w:bookmarkStart w:id="0" w:name="_GoBack"/>
-      <w:bookmarkEnd w:id="0"/>
-    </w:p>
-    <w:p>
-      <w:pPr>
         <w:pStyle w:val="Heading1"/>
       </w:pPr>
       <w:r>
@@ -3369,6 +3354,47 @@
       <w:r>
         <w:t xml:space="preserve"> with complex error handling (try-catch, null checks). Functional provides automatic parallelization, type-safe errors (Maybe/Either), and simple testing. Result: FP eliminates bug classes while enabling effortless concurrency.</w:t>
       </w:r>
+    </w:p>
+    <w:p>
+      <w:r>
+        <w:t xml:space="preserve">Demo Video: </w:t>
+      </w:r>
+      <w:hyperlink r:id="rId10" w:history="1">
+        <w:r>
+          <w:rPr>
+            <w:rStyle w:val="Hyperlink"/>
+          </w:rPr>
+          <w:t>https://youtu.be/cZZyrDFtpQQ</w:t>
+        </w:r>
+      </w:hyperlink>
+    </w:p>
+    <w:p>
+      <w:proofErr w:type="spellStart"/>
+      <w:r>
+        <w:t>Github</w:t>
+      </w:r>
+      <w:proofErr w:type="spellEnd"/>
+      <w:r>
+        <w:t xml:space="preserve"> Link: </w:t>
+      </w:r>
+      <w:hyperlink r:id="rId11" w:history="1">
+        <w:r>
+          <w:rPr>
+            <w:rStyle w:val="Hyperlink"/>
+          </w:rPr>
+          <w:t>https://github.com/IyenshiAUT/Genome-Matcher--Bioinformatics-Tool--Functional-Programming-</w:t>
+        </w:r>
+        <w:proofErr w:type="spellStart"/>
+        <w:r>
+          <w:rPr>
+            <w:rStyle w:val="Hyperlink"/>
+          </w:rPr>
+          <w:t>Project.git</w:t>
+        </w:r>
+        <w:proofErr w:type="spellEnd"/>
+      </w:hyperlink>
+      <w:bookmarkStart w:id="0" w:name="_GoBack"/>
+      <w:bookmarkEnd w:id="0"/>
     </w:p>
     <w:sectPr>
       <w:pgSz w:w="12240" w:h="15840"/>
@@ -5125,6 +5151,17 @@
     </w:pPr>
     <w:rPr>
       <w:rFonts w:ascii="Calibri" w:eastAsiaTheme="minorEastAsia" w:hAnsi="Calibri"/>
+    </w:rPr>
+  </w:style>
+  <w:style w:type="character" w:styleId="Hyperlink">
+    <w:name w:val="Hyperlink"/>
+    <w:basedOn w:val="DefaultParagraphFont"/>
+    <w:uiPriority w:val="99"/>
+    <w:unhideWhenUsed/>
+    <w:rsid w:val="00EA0C37"/>
+    <w:rPr>
+      <w:color w:val="0563C1" w:themeColor="hyperlink"/>
+      <w:u w:val="single"/>
     </w:rPr>
   </w:style>
 </w:styles>

</xml_diff>